<commit_message>
docs: Relatório completo para a atividade 2
</commit_message>
<xml_diff>
--- a/atv02/02-Leonardo_Cortes_Filho.docx
+++ b/atv02/02-Leonardo_Cortes_Filho.docx
@@ -86,7 +86,23 @@
           <w:sz w:val="20"/>
           <w:szCs w:val="20"/>
         </w:rPr>
-        <w:t xml:space="preserve">&lt;Nesta seção o participante deverá descrever com suas próprias palavras os temas abordados nas tarefas do card. É importante demonstrar que houve entendimento dos temas, isto mediante evidências com imagens, gráficos e textos originais produzidos por você. Códigos também podem ser referenciados desde que estejam no github ou Notebook entregue junto com o relatório&gt; </w:t>
+        <w:t xml:space="preserve">O video descreve de forma bem didática como criar agentes ReAct simples, enquanto nenhum aspecto é particularmente complicado, a combinação da engenharia de prompt e um modelo de linguagem pequeno já conseguiram criar uma ferramenta simples mas integrada com módulos </w:t>
+      </w:r>
+      <w:r>
+        <w:rPr>
+          <w:rFonts w:cs="Arial" w:ascii="Arial" w:hAnsi="Arial"/>
+          <w:sz w:val="20"/>
+          <w:szCs w:val="20"/>
+        </w:rPr>
+        <w:t>externos</w:t>
+      </w:r>
+      <w:r>
+        <w:rPr>
+          <w:rFonts w:cs="Arial" w:ascii="Arial" w:hAnsi="Arial"/>
+          <w:sz w:val="20"/>
+          <w:szCs w:val="20"/>
+        </w:rPr>
+        <w:t>, tendo respostas que um modelo local offline simplesmente não conseguiria responder.</w:t>
       </w:r>
     </w:p>
     <w:p>
@@ -94,11 +110,288 @@
         <w:pStyle w:val="Normal"/>
         <w:rPr>
           <w:rFonts w:ascii="Arial" w:hAnsi="Arial" w:cs="Arial"/>
-        </w:rPr>
-      </w:pPr>
-      <w:r>
-        <w:rPr>
-          <w:rFonts w:cs="Arial" w:ascii="Arial" w:hAnsi="Arial"/>
+          <w:sz w:val="20"/>
+          <w:szCs w:val="20"/>
+        </w:rPr>
+      </w:pPr>
+      <w:r>
+        <w:drawing>
+          <wp:anchor behindDoc="0" distT="0" distB="0" distL="0" distR="0" simplePos="0" locked="0" layoutInCell="0" allowOverlap="1" relativeHeight="2">
+            <wp:simplePos x="0" y="0"/>
+            <wp:positionH relativeFrom="column">
+              <wp:align>center</wp:align>
+            </wp:positionH>
+            <wp:positionV relativeFrom="paragraph">
+              <wp:posOffset>635</wp:posOffset>
+            </wp:positionV>
+            <wp:extent cx="3200400" cy="2962275"/>
+            <wp:effectExtent l="0" t="0" r="0" b="0"/>
+            <wp:wrapTopAndBottom/>
+            <wp:docPr id="1" name="Image1" descr=""/>
+            <wp:cNvGraphicFramePr>
+              <a:graphicFrameLocks xmlns:a="http://schemas.openxmlformats.org/drawingml/2006/main" noChangeAspect="1"/>
+            </wp:cNvGraphicFramePr>
+            <a:graphic xmlns:a="http://schemas.openxmlformats.org/drawingml/2006/main">
+              <a:graphicData uri="http://schemas.openxmlformats.org/drawingml/2006/picture">
+                <pic:pic xmlns:pic="http://schemas.openxmlformats.org/drawingml/2006/picture">
+                  <pic:nvPicPr>
+                    <pic:cNvPr id="1" name="Image1" descr=""/>
+                    <pic:cNvPicPr>
+                      <a:picLocks noChangeAspect="1" noChangeArrowheads="1"/>
+                    </pic:cNvPicPr>
+                  </pic:nvPicPr>
+                  <pic:blipFill>
+                    <a:blip r:embed="rId2"/>
+                    <a:stretch>
+                      <a:fillRect/>
+                    </a:stretch>
+                  </pic:blipFill>
+                  <pic:spPr bwMode="auto">
+                    <a:xfrm>
+                      <a:off x="0" y="0"/>
+                      <a:ext cx="3200400" cy="2962275"/>
+                    </a:xfrm>
+                    <a:prstGeom prst="rect">
+                      <a:avLst/>
+                    </a:prstGeom>
+                  </pic:spPr>
+                </pic:pic>
+              </a:graphicData>
+            </a:graphic>
+          </wp:anchor>
+        </w:drawing>
+      </w:r>
+      <w:r>
+        <w:rPr>
+          <w:rFonts w:cs="Arial" w:ascii="Arial" w:hAnsi="Arial"/>
+          <w:sz w:val="20"/>
+          <w:szCs w:val="20"/>
+        </w:rPr>
+        <w:t xml:space="preserve">Na minha perspectiva sistemas que usam esse tipo de técnica poderiam receber benefício imediato ao permitir mais modelos ou o uso de personas. </w:t>
+      </w:r>
+      <w:r>
+        <w:rPr>
+          <w:rFonts w:cs="Arial" w:ascii="Arial" w:hAnsi="Arial"/>
+          <w:sz w:val="20"/>
+          <w:szCs w:val="20"/>
+        </w:rPr>
+        <w:t>E</w:t>
+      </w:r>
+      <w:r>
+        <w:rPr>
+          <w:rFonts w:cs="Arial" w:ascii="Arial" w:hAnsi="Arial"/>
+          <w:sz w:val="20"/>
+          <w:szCs w:val="20"/>
+        </w:rPr>
+        <w:t xml:space="preserve">nquanto adicionar mais ferramentas seria útil, permitir mais articulação e raciocínio permite que a resposta final passe por mais passos </w:t>
+      </w:r>
+      <w:r>
+        <w:rPr>
+          <w:rFonts w:cs="Arial" w:ascii="Arial" w:hAnsi="Arial"/>
+          <w:sz w:val="20"/>
+          <w:szCs w:val="20"/>
+        </w:rPr>
+        <w:t>melhorando a qualidade das respostas. A</w:t>
+      </w:r>
+      <w:r>
+        <w:rPr>
+          <w:rFonts w:cs="Arial" w:ascii="Arial" w:hAnsi="Arial"/>
+          <w:sz w:val="20"/>
+          <w:szCs w:val="20"/>
+        </w:rPr>
+        <w:t xml:space="preserve">inda assim esse tipo de modelo também aparenta ter um tamanho ótimo, em que expansões futuras rapidamente perdem a eficiência de implementação, uma característica que também é afetada </w:t>
+      </w:r>
+      <w:r>
+        <w:rPr>
+          <w:rFonts w:cs="Arial" w:ascii="Arial" w:hAnsi="Arial"/>
+          <w:sz w:val="20"/>
+          <w:szCs w:val="20"/>
+        </w:rPr>
+        <w:t xml:space="preserve">por quais e como as </w:t>
+      </w:r>
+      <w:r>
+        <w:rPr>
+          <w:rFonts w:cs="Arial" w:ascii="Arial" w:hAnsi="Arial"/>
+          <w:sz w:val="20"/>
+          <w:szCs w:val="20"/>
+        </w:rPr>
+        <w:t xml:space="preserve">ferramentas </w:t>
+      </w:r>
+      <w:r>
+        <w:rPr>
+          <w:rFonts w:cs="Arial" w:ascii="Arial" w:hAnsi="Arial"/>
+          <w:sz w:val="20"/>
+          <w:szCs w:val="20"/>
+        </w:rPr>
+        <w:t xml:space="preserve">foram </w:t>
+      </w:r>
+      <w:r>
+        <w:rPr>
+          <w:rFonts w:cs="Arial" w:ascii="Arial" w:hAnsi="Arial"/>
+          <w:sz w:val="20"/>
+          <w:szCs w:val="20"/>
+        </w:rPr>
+        <w:t>implementadas.</w:t>
+      </w:r>
+    </w:p>
+    <w:p>
+      <w:pPr>
+        <w:pStyle w:val="Normal"/>
+        <w:rPr>
+          <w:rFonts w:ascii="Arial" w:hAnsi="Arial" w:cs="Arial"/>
+          <w:sz w:val="20"/>
+          <w:szCs w:val="20"/>
+        </w:rPr>
+      </w:pPr>
+      <w:r>
+        <w:rPr>
+          <w:rFonts w:cs="Arial" w:ascii="Arial" w:hAnsi="Arial"/>
+          <w:sz w:val="20"/>
+          <w:szCs w:val="20"/>
+        </w:rPr>
+        <w:t xml:space="preserve">O uso de temperature como 0, enquanto </w:t>
+      </w:r>
+      <w:r>
+        <w:rPr>
+          <w:rFonts w:cs="Arial" w:ascii="Arial" w:hAnsi="Arial"/>
+          <w:sz w:val="20"/>
+          <w:szCs w:val="20"/>
+        </w:rPr>
+        <w:t xml:space="preserve">apenas </w:t>
+      </w:r>
+      <w:r>
+        <w:rPr>
+          <w:rFonts w:cs="Arial" w:ascii="Arial" w:hAnsi="Arial"/>
+          <w:sz w:val="20"/>
+          <w:szCs w:val="20"/>
+        </w:rPr>
+        <w:t xml:space="preserve">retirado da página do Groq </w:t>
+      </w:r>
+      <w:r>
+        <w:rPr>
+          <w:rFonts w:cs="Arial" w:ascii="Arial" w:hAnsi="Arial"/>
+          <w:sz w:val="20"/>
+          <w:szCs w:val="20"/>
+        </w:rPr>
+        <w:t>(conforme as instruções),</w:t>
+      </w:r>
+      <w:r>
+        <w:rPr>
+          <w:rFonts w:cs="Arial" w:ascii="Arial" w:hAnsi="Arial"/>
+          <w:sz w:val="20"/>
+          <w:szCs w:val="20"/>
+        </w:rPr>
+        <w:t xml:space="preserve"> garantiu que o modelo não imaginasse informação, </w:t>
+      </w:r>
+      <w:r>
+        <w:rPr>
+          <w:rFonts w:cs="Arial" w:ascii="Arial" w:hAnsi="Arial"/>
+          <w:sz w:val="20"/>
+          <w:szCs w:val="20"/>
+        </w:rPr>
+        <w:t>usando</w:t>
+      </w:r>
+      <w:r>
+        <w:rPr>
+          <w:rFonts w:cs="Arial" w:ascii="Arial" w:hAnsi="Arial"/>
+          <w:sz w:val="20"/>
+          <w:szCs w:val="20"/>
+        </w:rPr>
+        <w:t xml:space="preserve"> apenas as ferramentas determinadas </w:t>
+      </w:r>
+      <w:r>
+        <w:rPr>
+          <w:rFonts w:cs="Arial" w:ascii="Arial" w:hAnsi="Arial"/>
+          <w:sz w:val="20"/>
+          <w:szCs w:val="20"/>
+        </w:rPr>
+        <w:t>e</w:t>
+      </w:r>
+      <w:r>
+        <w:rPr>
+          <w:rFonts w:cs="Arial" w:ascii="Arial" w:hAnsi="Arial"/>
+          <w:sz w:val="20"/>
+          <w:szCs w:val="20"/>
+        </w:rPr>
+        <w:t xml:space="preserve"> analisando </w:t>
+      </w:r>
+      <w:r>
+        <w:rPr>
+          <w:rFonts w:cs="Arial" w:ascii="Arial" w:hAnsi="Arial"/>
+          <w:sz w:val="20"/>
+          <w:szCs w:val="20"/>
+        </w:rPr>
+        <w:t xml:space="preserve">as respostas </w:t>
+      </w:r>
+      <w:r>
+        <w:rPr>
+          <w:rFonts w:cs="Arial" w:ascii="Arial" w:hAnsi="Arial"/>
+          <w:sz w:val="20"/>
+          <w:szCs w:val="20"/>
+        </w:rPr>
+        <w:t xml:space="preserve">de forma literal, </w:t>
+      </w:r>
+      <w:r>
+        <w:rPr>
+          <w:rFonts w:cs="Arial" w:ascii="Arial" w:hAnsi="Arial"/>
+          <w:sz w:val="20"/>
+          <w:szCs w:val="20"/>
+        </w:rPr>
+        <w:t xml:space="preserve">o que </w:t>
+      </w:r>
+      <w:r>
+        <w:rPr>
+          <w:rFonts w:cs="Arial" w:ascii="Arial" w:hAnsi="Arial"/>
+          <w:sz w:val="20"/>
+          <w:szCs w:val="20"/>
+        </w:rPr>
+        <w:t>permitiu resposta</w:t>
+      </w:r>
+      <w:r>
+        <w:rPr>
+          <w:rFonts w:cs="Arial" w:ascii="Arial" w:hAnsi="Arial"/>
+          <w:sz w:val="20"/>
+          <w:szCs w:val="20"/>
+        </w:rPr>
+        <w:t>s</w:t>
+      </w:r>
+      <w:r>
+        <w:rPr>
+          <w:rFonts w:cs="Arial" w:ascii="Arial" w:hAnsi="Arial"/>
+          <w:sz w:val="20"/>
+          <w:szCs w:val="20"/>
+        </w:rPr>
+        <w:t xml:space="preserve"> didaticamente muito precisas, mas devido essa escolha queries mais subjetivas teriam respostas insatisfatórias.</w:t>
+      </w:r>
+    </w:p>
+    <w:p>
+      <w:pPr>
+        <w:pStyle w:val="fastcamp"/>
+        <w:rPr/>
+      </w:pPr>
+      <w:r>
+        <w:rPr/>
+        <w:t xml:space="preserve">A </w:t>
+      </w:r>
+      <w:r>
+        <w:rPr/>
+        <w:t xml:space="preserve">ideia de usar a wikipedia aconteceu por eu ter visto um colega fazer isso anteriormente, o código para a tool foi feito baseado na </w:t>
+      </w:r>
+      <w:r>
+        <w:rPr/>
+        <w:t>página fonte e com ajuda do Claude, a ideia original do Claude era usar apenas summary(), a ideia de usar search() e page() veio estudando a página da lib e deixando mais granular para melhorar uma possível implementação com agentes futuramente.</w:t>
+      </w:r>
+    </w:p>
+    <w:p>
+      <w:pPr>
+        <w:pStyle w:val="fastcamp"/>
+        <w:rPr>
+          <w:rFonts w:ascii="Arial" w:hAnsi="Arial" w:cs="Arial"/>
+        </w:rPr>
+      </w:pPr>
+      <w:r>
+        <w:rPr>
+          <w:rFonts w:cs="Arial"/>
         </w:rPr>
       </w:r>
     </w:p>
@@ -143,12 +436,12 @@
         <w:pStyle w:val="Normal"/>
         <w:rPr>
           <w:rFonts w:ascii="Arial" w:hAnsi="Arial" w:cs="Arial"/>
-        </w:rPr>
-      </w:pPr>
-      <w:r>
-        <w:rPr>
-          <w:rFonts w:cs="Arial" w:ascii="Arial" w:hAnsi="Arial"/>
-        </w:rPr>
+          <w:sz w:val="20"/>
+          <w:szCs w:val="20"/>
+        </w:rPr>
+      </w:pPr>
+      <w:r>
+        <w:rPr/>
       </w:r>
     </w:p>
     <w:p>
@@ -171,20 +464,62 @@
     </w:p>
     <w:p>
       <w:pPr>
-        <w:pStyle w:val="Normal"/>
-        <w:rPr>
-          <w:rFonts w:ascii="Arial" w:hAnsi="Arial" w:cs="Arial"/>
-          <w:sz w:val="20"/>
-          <w:szCs w:val="20"/>
-        </w:rPr>
-      </w:pPr>
-      <w:r>
-        <w:rPr>
-          <w:rFonts w:cs="Arial" w:ascii="Arial" w:hAnsi="Arial"/>
-          <w:sz w:val="20"/>
-          <w:szCs w:val="20"/>
-        </w:rPr>
-        <w:t>&lt;Nesta seção o participante deverá descrever as suas conclusões sobre os temas abordados nas tarefas do card.&gt;</w:t>
+        <w:pStyle w:val="fastcamp"/>
+        <w:rPr/>
+      </w:pPr>
+      <w:r>
+        <w:rPr/>
+        <w:t xml:space="preserve">Uma implementação simples com agentes ReAct é extremamente rápida </w:t>
+      </w:r>
+      <w:r>
+        <w:rPr/>
+        <w:t>e bem poderosa</w:t>
+      </w:r>
+      <w:r>
+        <w:rPr/>
+        <w:t>, mas uma ferramenta simples como essa já demonstra diversas lacunas que podem ser preenchidas por otimização do código e também cedendo mais controle para o modelo.</w:t>
+      </w:r>
+    </w:p>
+    <w:p>
+      <w:pPr>
+        <w:pStyle w:val="fastcamp"/>
+        <w:numPr>
+          <w:ilvl w:val="0"/>
+          <w:numId w:val="4"/>
+        </w:numPr>
+        <w:rPr/>
+      </w:pPr>
+      <w:r>
+        <w:rPr/>
+        <w:t>A temperature poderia ser controlada por um modelo, permitindo respostas subjetivas quando necessário.</w:t>
+      </w:r>
+    </w:p>
+    <w:p>
+      <w:pPr>
+        <w:pStyle w:val="fastcamp"/>
+        <w:numPr>
+          <w:ilvl w:val="0"/>
+          <w:numId w:val="4"/>
+        </w:numPr>
+        <w:rPr/>
+      </w:pPr>
+      <w:r>
+        <w:rPr/>
+        <w:t>A pesquisa realizada, conforme já registrado, poderia ser feita mais diretamente pelo modelo, o permitindo decidir o que é relevante e permitindo pesquisas mais livres.</w:t>
+      </w:r>
+    </w:p>
+    <w:p>
+      <w:pPr>
+        <w:pStyle w:val="fastcamp"/>
+        <w:numPr>
+          <w:ilvl w:val="0"/>
+          <w:numId w:val="4"/>
+        </w:numPr>
+        <w:rPr/>
+      </w:pPr>
+      <w:r>
+        <w:rPr/>
+        <w:t>Pesquisas diretas na internet permitiriam responder muito mais perguntas do que acessar apenas a wikipedia.</w:t>
       </w:r>
     </w:p>
     <w:p>
@@ -238,8 +573,55 @@
           <w:sz w:val="20"/>
           <w:szCs w:val="20"/>
         </w:rPr>
-        <w:t>&lt; Nesta seção deveram ser descritas as referências utilizadas para o desenvolvimento do relatório. Caso tenham sido utilizadas outras referências além das do card, também deveram estar descritas.&gt;</w:t>
-      </w:r>
+        <w:t>Do card:</w:t>
+      </w:r>
+    </w:p>
+    <w:p>
+      <w:pPr>
+        <w:pStyle w:val="fastcamp"/>
+        <w:numPr>
+          <w:ilvl w:val="0"/>
+          <w:numId w:val="2"/>
+        </w:numPr>
+        <w:rPr/>
+      </w:pPr>
+      <w:hyperlink r:id="rId3">
+        <w:r>
+          <w:rPr>
+            <w:rStyle w:val="Hyperlink"/>
+          </w:rPr>
+          <w:t>https://www.youtube.com/watch?v=hKVhRA9kfeM</w:t>
+        </w:r>
+      </w:hyperlink>
+    </w:p>
+    <w:p>
+      <w:pPr>
+        <w:pStyle w:val="fastcamp"/>
+        <w:rPr/>
+      </w:pPr>
+      <w:r>
+        <w:rPr/>
+        <w:t>Externa:</w:t>
+      </w:r>
+    </w:p>
+    <w:p>
+      <w:pPr>
+        <w:pStyle w:val="fastcamp"/>
+        <w:numPr>
+          <w:ilvl w:val="0"/>
+          <w:numId w:val="3"/>
+        </w:numPr>
+        <w:spacing w:before="0" w:after="160"/>
+        <w:rPr/>
+      </w:pPr>
+      <w:hyperlink r:id="rId4">
+        <w:r>
+          <w:rPr>
+            <w:rStyle w:val="Hyperlink"/>
+          </w:rPr>
+          <w:t>https://pypi.org/project/wikipedia/</w:t>
+        </w:r>
+      </w:hyperlink>
     </w:p>
     <w:sectPr>
       <w:type w:val="nextPage"/>
@@ -252,6 +634,553 @@
     </w:sectPr>
   </w:body>
 </w:document>
+</file>
+
+<file path=word/numbering.xml><?xml version="1.0" encoding="utf-8"?>
+<w:numbering xmlns:w="http://schemas.openxmlformats.org/wordprocessingml/2006/main" xmlns:o="urn:schemas-microsoft-com:office:office" xmlns:r="http://schemas.openxmlformats.org/officeDocument/2006/relationships" xmlns:v="urn:schemas-microsoft-com:vml" xmlns:mc="http://schemas.openxmlformats.org/markup-compatibility/2006" xmlns:w14="http://schemas.microsoft.com/office/word/2010/wordml" mc:Ignorable="w14">
+  <w:abstractNum w:abstractNumId="1">
+    <w:lvl w:ilvl="0">
+      <w:start w:val="1"/>
+      <w:numFmt w:val="none"/>
+      <w:suff w:val="nothing"/>
+      <w:lvlText w:val=""/>
+      <w:lvlJc w:val="left"/>
+      <w:pPr>
+        <w:tabs>
+          <w:tab w:val="num" w:pos="0"/>
+        </w:tabs>
+        <w:ind w:left="0" w:hanging="0"/>
+      </w:pPr>
+    </w:lvl>
+    <w:lvl w:ilvl="1">
+      <w:start w:val="1"/>
+      <w:numFmt w:val="none"/>
+      <w:suff w:val="nothing"/>
+      <w:lvlText w:val=""/>
+      <w:lvlJc w:val="left"/>
+      <w:pPr>
+        <w:tabs>
+          <w:tab w:val="num" w:pos="0"/>
+        </w:tabs>
+        <w:ind w:left="0" w:hanging="0"/>
+      </w:pPr>
+    </w:lvl>
+    <w:lvl w:ilvl="2">
+      <w:start w:val="1"/>
+      <w:numFmt w:val="none"/>
+      <w:suff w:val="nothing"/>
+      <w:lvlText w:val=""/>
+      <w:lvlJc w:val="left"/>
+      <w:pPr>
+        <w:tabs>
+          <w:tab w:val="num" w:pos="0"/>
+        </w:tabs>
+        <w:ind w:left="0" w:hanging="0"/>
+      </w:pPr>
+    </w:lvl>
+    <w:lvl w:ilvl="3">
+      <w:start w:val="1"/>
+      <w:numFmt w:val="none"/>
+      <w:suff w:val="nothing"/>
+      <w:lvlText w:val=""/>
+      <w:lvlJc w:val="left"/>
+      <w:pPr>
+        <w:tabs>
+          <w:tab w:val="num" w:pos="0"/>
+        </w:tabs>
+        <w:ind w:left="0" w:hanging="0"/>
+      </w:pPr>
+    </w:lvl>
+    <w:lvl w:ilvl="4">
+      <w:start w:val="1"/>
+      <w:numFmt w:val="none"/>
+      <w:suff w:val="nothing"/>
+      <w:lvlText w:val=""/>
+      <w:lvlJc w:val="left"/>
+      <w:pPr>
+        <w:tabs>
+          <w:tab w:val="num" w:pos="0"/>
+        </w:tabs>
+        <w:ind w:left="0" w:hanging="0"/>
+      </w:pPr>
+    </w:lvl>
+    <w:lvl w:ilvl="5">
+      <w:start w:val="1"/>
+      <w:numFmt w:val="none"/>
+      <w:suff w:val="nothing"/>
+      <w:lvlText w:val=""/>
+      <w:lvlJc w:val="left"/>
+      <w:pPr>
+        <w:tabs>
+          <w:tab w:val="num" w:pos="0"/>
+        </w:tabs>
+        <w:ind w:left="0" w:hanging="0"/>
+      </w:pPr>
+    </w:lvl>
+    <w:lvl w:ilvl="6">
+      <w:start w:val="1"/>
+      <w:numFmt w:val="none"/>
+      <w:suff w:val="nothing"/>
+      <w:lvlText w:val=""/>
+      <w:lvlJc w:val="left"/>
+      <w:pPr>
+        <w:tabs>
+          <w:tab w:val="num" w:pos="0"/>
+        </w:tabs>
+        <w:ind w:left="0" w:hanging="0"/>
+      </w:pPr>
+    </w:lvl>
+    <w:lvl w:ilvl="7">
+      <w:start w:val="1"/>
+      <w:numFmt w:val="none"/>
+      <w:suff w:val="nothing"/>
+      <w:lvlText w:val=""/>
+      <w:lvlJc w:val="left"/>
+      <w:pPr>
+        <w:tabs>
+          <w:tab w:val="num" w:pos="0"/>
+        </w:tabs>
+        <w:ind w:left="0" w:hanging="0"/>
+      </w:pPr>
+    </w:lvl>
+    <w:lvl w:ilvl="8">
+      <w:start w:val="1"/>
+      <w:numFmt w:val="none"/>
+      <w:suff w:val="nothing"/>
+      <w:lvlText w:val=""/>
+      <w:lvlJc w:val="left"/>
+      <w:pPr>
+        <w:tabs>
+          <w:tab w:val="num" w:pos="0"/>
+        </w:tabs>
+        <w:ind w:left="0" w:hanging="0"/>
+      </w:pPr>
+    </w:lvl>
+  </w:abstractNum>
+  <w:abstractNum w:abstractNumId="2">
+    <w:lvl w:ilvl="0">
+      <w:start w:val="1"/>
+      <w:numFmt w:val="bullet"/>
+      <w:lvlText w:val=""/>
+      <w:lvlJc w:val="left"/>
+      <w:pPr>
+        <w:tabs>
+          <w:tab w:val="num" w:pos="720"/>
+        </w:tabs>
+        <w:ind w:left="720" w:hanging="360"/>
+      </w:pPr>
+      <w:rPr>
+        <w:rFonts w:ascii="Symbol" w:hAnsi="Symbol" w:cs="Symbol" w:hint="default"/>
+      </w:rPr>
+    </w:lvl>
+    <w:lvl w:ilvl="1">
+      <w:start w:val="1"/>
+      <w:numFmt w:val="bullet"/>
+      <w:lvlText w:val="◦"/>
+      <w:lvlJc w:val="left"/>
+      <w:pPr>
+        <w:tabs>
+          <w:tab w:val="num" w:pos="1080"/>
+        </w:tabs>
+        <w:ind w:left="1080" w:hanging="360"/>
+      </w:pPr>
+      <w:rPr>
+        <w:rFonts w:ascii="OpenSymbol" w:hAnsi="OpenSymbol" w:cs="OpenSymbol" w:hint="default"/>
+      </w:rPr>
+    </w:lvl>
+    <w:lvl w:ilvl="2">
+      <w:start w:val="1"/>
+      <w:numFmt w:val="bullet"/>
+      <w:lvlText w:val="▪"/>
+      <w:lvlJc w:val="left"/>
+      <w:pPr>
+        <w:tabs>
+          <w:tab w:val="num" w:pos="1440"/>
+        </w:tabs>
+        <w:ind w:left="1440" w:hanging="360"/>
+      </w:pPr>
+      <w:rPr>
+        <w:rFonts w:ascii="OpenSymbol" w:hAnsi="OpenSymbol" w:cs="OpenSymbol" w:hint="default"/>
+      </w:rPr>
+    </w:lvl>
+    <w:lvl w:ilvl="3">
+      <w:start w:val="1"/>
+      <w:numFmt w:val="bullet"/>
+      <w:lvlText w:val=""/>
+      <w:lvlJc w:val="left"/>
+      <w:pPr>
+        <w:tabs>
+          <w:tab w:val="num" w:pos="1800"/>
+        </w:tabs>
+        <w:ind w:left="1800" w:hanging="360"/>
+      </w:pPr>
+      <w:rPr>
+        <w:rFonts w:ascii="Symbol" w:hAnsi="Symbol" w:cs="Symbol" w:hint="default"/>
+      </w:rPr>
+    </w:lvl>
+    <w:lvl w:ilvl="4">
+      <w:start w:val="1"/>
+      <w:numFmt w:val="bullet"/>
+      <w:lvlText w:val="◦"/>
+      <w:lvlJc w:val="left"/>
+      <w:pPr>
+        <w:tabs>
+          <w:tab w:val="num" w:pos="2160"/>
+        </w:tabs>
+        <w:ind w:left="2160" w:hanging="360"/>
+      </w:pPr>
+      <w:rPr>
+        <w:rFonts w:ascii="OpenSymbol" w:hAnsi="OpenSymbol" w:cs="OpenSymbol" w:hint="default"/>
+      </w:rPr>
+    </w:lvl>
+    <w:lvl w:ilvl="5">
+      <w:start w:val="1"/>
+      <w:numFmt w:val="bullet"/>
+      <w:lvlText w:val="▪"/>
+      <w:lvlJc w:val="left"/>
+      <w:pPr>
+        <w:tabs>
+          <w:tab w:val="num" w:pos="2520"/>
+        </w:tabs>
+        <w:ind w:left="2520" w:hanging="360"/>
+      </w:pPr>
+      <w:rPr>
+        <w:rFonts w:ascii="OpenSymbol" w:hAnsi="OpenSymbol" w:cs="OpenSymbol" w:hint="default"/>
+      </w:rPr>
+    </w:lvl>
+    <w:lvl w:ilvl="6">
+      <w:start w:val="1"/>
+      <w:numFmt w:val="bullet"/>
+      <w:lvlText w:val=""/>
+      <w:lvlJc w:val="left"/>
+      <w:pPr>
+        <w:tabs>
+          <w:tab w:val="num" w:pos="2880"/>
+        </w:tabs>
+        <w:ind w:left="2880" w:hanging="360"/>
+      </w:pPr>
+      <w:rPr>
+        <w:rFonts w:ascii="Symbol" w:hAnsi="Symbol" w:cs="Symbol" w:hint="default"/>
+      </w:rPr>
+    </w:lvl>
+    <w:lvl w:ilvl="7">
+      <w:start w:val="1"/>
+      <w:numFmt w:val="bullet"/>
+      <w:lvlText w:val="◦"/>
+      <w:lvlJc w:val="left"/>
+      <w:pPr>
+        <w:tabs>
+          <w:tab w:val="num" w:pos="3240"/>
+        </w:tabs>
+        <w:ind w:left="3240" w:hanging="360"/>
+      </w:pPr>
+      <w:rPr>
+        <w:rFonts w:ascii="OpenSymbol" w:hAnsi="OpenSymbol" w:cs="OpenSymbol" w:hint="default"/>
+      </w:rPr>
+    </w:lvl>
+    <w:lvl w:ilvl="8">
+      <w:start w:val="1"/>
+      <w:numFmt w:val="bullet"/>
+      <w:lvlText w:val="▪"/>
+      <w:lvlJc w:val="left"/>
+      <w:pPr>
+        <w:tabs>
+          <w:tab w:val="num" w:pos="3600"/>
+        </w:tabs>
+        <w:ind w:left="3600" w:hanging="360"/>
+      </w:pPr>
+      <w:rPr>
+        <w:rFonts w:ascii="OpenSymbol" w:hAnsi="OpenSymbol" w:cs="OpenSymbol" w:hint="default"/>
+      </w:rPr>
+    </w:lvl>
+  </w:abstractNum>
+  <w:abstractNum w:abstractNumId="3">
+    <w:lvl w:ilvl="0">
+      <w:start w:val="1"/>
+      <w:numFmt w:val="bullet"/>
+      <w:lvlText w:val=""/>
+      <w:lvlJc w:val="left"/>
+      <w:pPr>
+        <w:tabs>
+          <w:tab w:val="num" w:pos="720"/>
+        </w:tabs>
+        <w:ind w:left="720" w:hanging="360"/>
+      </w:pPr>
+      <w:rPr>
+        <w:rFonts w:ascii="Symbol" w:hAnsi="Symbol" w:cs="Symbol" w:hint="default"/>
+      </w:rPr>
+    </w:lvl>
+    <w:lvl w:ilvl="1">
+      <w:start w:val="1"/>
+      <w:numFmt w:val="bullet"/>
+      <w:lvlText w:val="◦"/>
+      <w:lvlJc w:val="left"/>
+      <w:pPr>
+        <w:tabs>
+          <w:tab w:val="num" w:pos="1080"/>
+        </w:tabs>
+        <w:ind w:left="1080" w:hanging="360"/>
+      </w:pPr>
+      <w:rPr>
+        <w:rFonts w:ascii="OpenSymbol" w:hAnsi="OpenSymbol" w:cs="OpenSymbol" w:hint="default"/>
+      </w:rPr>
+    </w:lvl>
+    <w:lvl w:ilvl="2">
+      <w:start w:val="1"/>
+      <w:numFmt w:val="bullet"/>
+      <w:lvlText w:val="▪"/>
+      <w:lvlJc w:val="left"/>
+      <w:pPr>
+        <w:tabs>
+          <w:tab w:val="num" w:pos="1440"/>
+        </w:tabs>
+        <w:ind w:left="1440" w:hanging="360"/>
+      </w:pPr>
+      <w:rPr>
+        <w:rFonts w:ascii="OpenSymbol" w:hAnsi="OpenSymbol" w:cs="OpenSymbol" w:hint="default"/>
+      </w:rPr>
+    </w:lvl>
+    <w:lvl w:ilvl="3">
+      <w:start w:val="1"/>
+      <w:numFmt w:val="bullet"/>
+      <w:lvlText w:val=""/>
+      <w:lvlJc w:val="left"/>
+      <w:pPr>
+        <w:tabs>
+          <w:tab w:val="num" w:pos="1800"/>
+        </w:tabs>
+        <w:ind w:left="1800" w:hanging="360"/>
+      </w:pPr>
+      <w:rPr>
+        <w:rFonts w:ascii="Symbol" w:hAnsi="Symbol" w:cs="Symbol" w:hint="default"/>
+      </w:rPr>
+    </w:lvl>
+    <w:lvl w:ilvl="4">
+      <w:start w:val="1"/>
+      <w:numFmt w:val="bullet"/>
+      <w:lvlText w:val="◦"/>
+      <w:lvlJc w:val="left"/>
+      <w:pPr>
+        <w:tabs>
+          <w:tab w:val="num" w:pos="2160"/>
+        </w:tabs>
+        <w:ind w:left="2160" w:hanging="360"/>
+      </w:pPr>
+      <w:rPr>
+        <w:rFonts w:ascii="OpenSymbol" w:hAnsi="OpenSymbol" w:cs="OpenSymbol" w:hint="default"/>
+      </w:rPr>
+    </w:lvl>
+    <w:lvl w:ilvl="5">
+      <w:start w:val="1"/>
+      <w:numFmt w:val="bullet"/>
+      <w:lvlText w:val="▪"/>
+      <w:lvlJc w:val="left"/>
+      <w:pPr>
+        <w:tabs>
+          <w:tab w:val="num" w:pos="2520"/>
+        </w:tabs>
+        <w:ind w:left="2520" w:hanging="360"/>
+      </w:pPr>
+      <w:rPr>
+        <w:rFonts w:ascii="OpenSymbol" w:hAnsi="OpenSymbol" w:cs="OpenSymbol" w:hint="default"/>
+      </w:rPr>
+    </w:lvl>
+    <w:lvl w:ilvl="6">
+      <w:start w:val="1"/>
+      <w:numFmt w:val="bullet"/>
+      <w:lvlText w:val=""/>
+      <w:lvlJc w:val="left"/>
+      <w:pPr>
+        <w:tabs>
+          <w:tab w:val="num" w:pos="2880"/>
+        </w:tabs>
+        <w:ind w:left="2880" w:hanging="360"/>
+      </w:pPr>
+      <w:rPr>
+        <w:rFonts w:ascii="Symbol" w:hAnsi="Symbol" w:cs="Symbol" w:hint="default"/>
+      </w:rPr>
+    </w:lvl>
+    <w:lvl w:ilvl="7">
+      <w:start w:val="1"/>
+      <w:numFmt w:val="bullet"/>
+      <w:lvlText w:val="◦"/>
+      <w:lvlJc w:val="left"/>
+      <w:pPr>
+        <w:tabs>
+          <w:tab w:val="num" w:pos="3240"/>
+        </w:tabs>
+        <w:ind w:left="3240" w:hanging="360"/>
+      </w:pPr>
+      <w:rPr>
+        <w:rFonts w:ascii="OpenSymbol" w:hAnsi="OpenSymbol" w:cs="OpenSymbol" w:hint="default"/>
+      </w:rPr>
+    </w:lvl>
+    <w:lvl w:ilvl="8">
+      <w:start w:val="1"/>
+      <w:numFmt w:val="bullet"/>
+      <w:lvlText w:val="▪"/>
+      <w:lvlJc w:val="left"/>
+      <w:pPr>
+        <w:tabs>
+          <w:tab w:val="num" w:pos="3600"/>
+        </w:tabs>
+        <w:ind w:left="3600" w:hanging="360"/>
+      </w:pPr>
+      <w:rPr>
+        <w:rFonts w:ascii="OpenSymbol" w:hAnsi="OpenSymbol" w:cs="OpenSymbol" w:hint="default"/>
+      </w:rPr>
+    </w:lvl>
+  </w:abstractNum>
+  <w:abstractNum w:abstractNumId="4">
+    <w:lvl w:ilvl="0">
+      <w:start w:val="1"/>
+      <w:numFmt w:val="bullet"/>
+      <w:lvlText w:val=""/>
+      <w:lvlJc w:val="left"/>
+      <w:pPr>
+        <w:tabs>
+          <w:tab w:val="num" w:pos="720"/>
+        </w:tabs>
+        <w:ind w:left="720" w:hanging="360"/>
+      </w:pPr>
+      <w:rPr>
+        <w:rFonts w:ascii="Symbol" w:hAnsi="Symbol" w:cs="Symbol" w:hint="default"/>
+      </w:rPr>
+    </w:lvl>
+    <w:lvl w:ilvl="1">
+      <w:start w:val="1"/>
+      <w:numFmt w:val="bullet"/>
+      <w:lvlText w:val="◦"/>
+      <w:lvlJc w:val="left"/>
+      <w:pPr>
+        <w:tabs>
+          <w:tab w:val="num" w:pos="1080"/>
+        </w:tabs>
+        <w:ind w:left="1080" w:hanging="360"/>
+      </w:pPr>
+      <w:rPr>
+        <w:rFonts w:ascii="OpenSymbol" w:hAnsi="OpenSymbol" w:cs="OpenSymbol" w:hint="default"/>
+      </w:rPr>
+    </w:lvl>
+    <w:lvl w:ilvl="2">
+      <w:start w:val="1"/>
+      <w:numFmt w:val="bullet"/>
+      <w:lvlText w:val="▪"/>
+      <w:lvlJc w:val="left"/>
+      <w:pPr>
+        <w:tabs>
+          <w:tab w:val="num" w:pos="1440"/>
+        </w:tabs>
+        <w:ind w:left="1440" w:hanging="360"/>
+      </w:pPr>
+      <w:rPr>
+        <w:rFonts w:ascii="OpenSymbol" w:hAnsi="OpenSymbol" w:cs="OpenSymbol" w:hint="default"/>
+      </w:rPr>
+    </w:lvl>
+    <w:lvl w:ilvl="3">
+      <w:start w:val="1"/>
+      <w:numFmt w:val="bullet"/>
+      <w:lvlText w:val=""/>
+      <w:lvlJc w:val="left"/>
+      <w:pPr>
+        <w:tabs>
+          <w:tab w:val="num" w:pos="1800"/>
+        </w:tabs>
+        <w:ind w:left="1800" w:hanging="360"/>
+      </w:pPr>
+      <w:rPr>
+        <w:rFonts w:ascii="Symbol" w:hAnsi="Symbol" w:cs="Symbol" w:hint="default"/>
+      </w:rPr>
+    </w:lvl>
+    <w:lvl w:ilvl="4">
+      <w:start w:val="1"/>
+      <w:numFmt w:val="bullet"/>
+      <w:lvlText w:val="◦"/>
+      <w:lvlJc w:val="left"/>
+      <w:pPr>
+        <w:tabs>
+          <w:tab w:val="num" w:pos="2160"/>
+        </w:tabs>
+        <w:ind w:left="2160" w:hanging="360"/>
+      </w:pPr>
+      <w:rPr>
+        <w:rFonts w:ascii="OpenSymbol" w:hAnsi="OpenSymbol" w:cs="OpenSymbol" w:hint="default"/>
+      </w:rPr>
+    </w:lvl>
+    <w:lvl w:ilvl="5">
+      <w:start w:val="1"/>
+      <w:numFmt w:val="bullet"/>
+      <w:lvlText w:val="▪"/>
+      <w:lvlJc w:val="left"/>
+      <w:pPr>
+        <w:tabs>
+          <w:tab w:val="num" w:pos="2520"/>
+        </w:tabs>
+        <w:ind w:left="2520" w:hanging="360"/>
+      </w:pPr>
+      <w:rPr>
+        <w:rFonts w:ascii="OpenSymbol" w:hAnsi="OpenSymbol" w:cs="OpenSymbol" w:hint="default"/>
+      </w:rPr>
+    </w:lvl>
+    <w:lvl w:ilvl="6">
+      <w:start w:val="1"/>
+      <w:numFmt w:val="bullet"/>
+      <w:lvlText w:val=""/>
+      <w:lvlJc w:val="left"/>
+      <w:pPr>
+        <w:tabs>
+          <w:tab w:val="num" w:pos="2880"/>
+        </w:tabs>
+        <w:ind w:left="2880" w:hanging="360"/>
+      </w:pPr>
+      <w:rPr>
+        <w:rFonts w:ascii="Symbol" w:hAnsi="Symbol" w:cs="Symbol" w:hint="default"/>
+      </w:rPr>
+    </w:lvl>
+    <w:lvl w:ilvl="7">
+      <w:start w:val="1"/>
+      <w:numFmt w:val="bullet"/>
+      <w:lvlText w:val="◦"/>
+      <w:lvlJc w:val="left"/>
+      <w:pPr>
+        <w:tabs>
+          <w:tab w:val="num" w:pos="3240"/>
+        </w:tabs>
+        <w:ind w:left="3240" w:hanging="360"/>
+      </w:pPr>
+      <w:rPr>
+        <w:rFonts w:ascii="OpenSymbol" w:hAnsi="OpenSymbol" w:cs="OpenSymbol" w:hint="default"/>
+      </w:rPr>
+    </w:lvl>
+    <w:lvl w:ilvl="8">
+      <w:start w:val="1"/>
+      <w:numFmt w:val="bullet"/>
+      <w:lvlText w:val="▪"/>
+      <w:lvlJc w:val="left"/>
+      <w:pPr>
+        <w:tabs>
+          <w:tab w:val="num" w:pos="3600"/>
+        </w:tabs>
+        <w:ind w:left="3600" w:hanging="360"/>
+      </w:pPr>
+      <w:rPr>
+        <w:rFonts w:ascii="OpenSymbol" w:hAnsi="OpenSymbol" w:cs="OpenSymbol" w:hint="default"/>
+      </w:rPr>
+    </w:lvl>
+  </w:abstractNum>
+  <w:num w:numId="1">
+    <w:abstractNumId w:val="1"/>
+  </w:num>
+  <w:num w:numId="2">
+    <w:abstractNumId w:val="2"/>
+  </w:num>
+  <w:num w:numId="3">
+    <w:abstractNumId w:val="3"/>
+  </w:num>
+  <w:num w:numId="4">
+    <w:abstractNumId w:val="4"/>
+  </w:num>
+</w:numbering>
 </file>
 
 <file path=word/styles.xml><?xml version="1.0" encoding="utf-8"?>
@@ -680,6 +1609,20 @@
     <w:qFormat/>
     <w:rPr/>
   </w:style>
+  <w:style w:type="character" w:styleId="Bullets">
+    <w:name w:val="Bullets"/>
+    <w:qFormat/>
+    <w:rPr>
+      <w:rFonts w:ascii="OpenSymbol" w:hAnsi="OpenSymbol" w:eastAsia="OpenSymbol" w:cs="OpenSymbol"/>
+    </w:rPr>
+  </w:style>
+  <w:style w:type="character" w:styleId="Hyperlink">
+    <w:name w:val="Hyperlink"/>
+    <w:rPr>
+      <w:color w:val="000080"/>
+      <w:u w:val="single"/>
+    </w:rPr>
+  </w:style>
   <w:style w:type="paragraph" w:styleId="Heading">
     <w:name w:val="Heading"/>
     <w:basedOn w:val="Normal"/>
@@ -737,6 +1680,27 @@
     <w:rPr>
       <w:rFonts w:cs="Noto Sans Devanagari"/>
     </w:rPr>
+  </w:style>
+  <w:style w:type="paragraph" w:styleId="fastcamp">
+    <w:name w:val="fastcamp"/>
+    <w:basedOn w:val="Normal"/>
+    <w:qFormat/>
+    <w:pPr/>
+    <w:rPr>
+      <w:rFonts w:ascii="Arial" w:hAnsi="Arial" w:cs="Arial"/>
+      <w:sz w:val="20"/>
+      <w:szCs w:val="20"/>
+    </w:rPr>
+  </w:style>
+  <w:style w:type="paragraph" w:styleId="TableContents">
+    <w:name w:val="Table Contents"/>
+    <w:basedOn w:val="Normal"/>
+    <w:qFormat/>
+    <w:pPr>
+      <w:widowControl w:val="false"/>
+      <w:suppressLineNumbers/>
+    </w:pPr>
+    <w:rPr/>
   </w:style>
   <w:style w:type="numbering" w:styleId="NoList" w:default="1">
     <w:name w:val="No List"/>

</xml_diff>